<commit_message>
Save local practical-2 changes
</commit_message>
<xml_diff>
--- a/practical-2/practical-2.docx
+++ b/practical-2/practical-2.docx
@@ -1,6 +1,6 @@
 
 <file path=word/document.xml><?xml version="1.0" encoding="utf-8"?>
-<w:document xmlns:wpc="http://schemas.microsoft.com/office/word/2010/wordprocessingCanvas" xmlns:cx="http://schemas.microsoft.com/office/drawing/2014/chartex" xmlns:cx1="http://schemas.microsoft.com/office/drawing/2015/9/8/chartex" xmlns:cx2="http://schemas.microsoft.com/office/drawing/2015/10/21/chartex" xmlns:cx3="http://schemas.microsoft.com/office/drawing/2016/5/9/chartex" xmlns:cx4="http://schemas.microsoft.com/office/drawing/2016/5/10/chartex" xmlns:cx5="http://schemas.microsoft.com/office/drawing/2016/5/11/chartex" xmlns:cx6="http://schemas.microsoft.com/office/drawing/2016/5/12/chartex" xmlns:cx7="http://schemas.microsoft.com/office/drawing/2016/5/13/chartex" xmlns:cx8="http://schemas.microsoft.com/office/drawing/2016/5/14/chartex" xmlns:mc="http://schemas.openxmlformats.org/markup-compatibility/2006" xmlns:aink="http://schemas.microsoft.com/office/drawing/2016/ink" xmlns:am3d="http://schemas.microsoft.com/office/drawing/2017/model3d" xmlns:o="urn:schemas-microsoft-com:office:office" xmlns:oel="http://schemas.microsoft.com/office/2019/extlst" xmlns:r="http://schemas.openxmlformats.org/officeDocument/2006/relationships" xmlns:m="http://schemas.openxmlformats.org/officeDocument/2006/math" xmlns:v="urn:schemas-microsoft-com:vml" xmlns:wp14="http://schemas.microsoft.com/office/word/2010/wordprocessingDrawing" xmlns:wp="http://schemas.openxmlformats.org/drawingml/2006/wordprocessingDrawing" xmlns:w10="urn:schemas-microsoft-com:office:word" xmlns:w="http://schemas.openxmlformats.org/wordprocessingml/2006/main" xmlns:w14="http://schemas.microsoft.com/office/word/2010/wordml" xmlns:w15="http://schemas.microsoft.com/office/word/2012/wordml" xmlns:w16cex="http://schemas.microsoft.com/office/word/2018/wordml/cex" xmlns:w16cid="http://schemas.microsoft.com/office/word/2016/wordml/cid" xmlns:w16="http://schemas.microsoft.com/office/word/2018/wordml" xmlns:w16du="http://schemas.microsoft.com/office/word/2023/wordml/word16du" xmlns:w16sdtdh="http://schemas.microsoft.com/office/word/2020/wordml/sdtdatahash" xmlns:w16sdtfl="http://schemas.microsoft.com/office/word/2024/wordml/sdtformatlock" xmlns:w16se="http://schemas.microsoft.com/office/word/2015/wordml/symex" xmlns:wpg="http://schemas.microsoft.com/office/word/2010/wordprocessingGroup" xmlns:wpi="http://schemas.microsoft.com/office/word/2010/wordprocessingInk" xmlns:wne="http://schemas.microsoft.com/office/word/2006/wordml" xmlns:wps="http://schemas.microsoft.com/office/word/2010/wordprocessingShape" mc:Ignorable="w14 w15 w16se w16cid w16 w16cex w16sdtdh w16sdtfl w16du wp14">
+<w:document xmlns:wpc="http://schemas.microsoft.com/office/word/2010/wordprocessingCanvas" xmlns:cx="http://schemas.microsoft.com/office/drawing/2014/chartex" xmlns:cx1="http://schemas.microsoft.com/office/drawing/2015/9/8/chartex" xmlns:cx2="http://schemas.microsoft.com/office/drawing/2015/10/21/chartex" xmlns:cx3="http://schemas.microsoft.com/office/drawing/2016/5/9/chartex" xmlns:cx4="http://schemas.microsoft.com/office/drawing/2016/5/10/chartex" xmlns:cx5="http://schemas.microsoft.com/office/drawing/2016/5/11/chartex" xmlns:cx6="http://schemas.microsoft.com/office/drawing/2016/5/12/chartex" xmlns:cx7="http://schemas.microsoft.com/office/drawing/2016/5/13/chartex" xmlns:cx8="http://schemas.microsoft.com/office/drawing/2016/5/14/chartex" xmlns:mc="http://schemas.openxmlformats.org/markup-compatibility/2006" xmlns:aink="http://schemas.microsoft.com/office/drawing/2016/ink" xmlns:am3d="http://schemas.microsoft.com/office/drawing/2017/model3d" xmlns:o="urn:schemas-microsoft-com:office:office" xmlns:oel="http://schemas.microsoft.com/office/2019/extlst" xmlns:r="http://schemas.openxmlformats.org/officeDocument/2006/relationships" xmlns:m="http://schemas.openxmlformats.org/officeDocument/2006/math" xmlns:v="urn:schemas-microsoft-com:vml" xmlns:wp14="http://schemas.microsoft.com/office/word/2010/wordprocessingDrawing" xmlns:wp="http://schemas.openxmlformats.org/drawingml/2006/wordprocessingDrawing" xmlns:w10="urn:schemas-microsoft-com:office:word" xmlns:w="http://schemas.openxmlformats.org/wordprocessingml/2006/main" xmlns:w14="http://schemas.microsoft.com/office/word/2010/wordml" xmlns:w15="http://schemas.microsoft.com/office/word/2012/wordml" xmlns:w16cei="http://schemas.microsoft.com/office/word/2026/wordml/cei" xmlns:w16cex="http://schemas.microsoft.com/office/word/2018/wordml/cex" xmlns:w16cid="http://schemas.microsoft.com/office/word/2016/wordml/cid" xmlns:w16="http://schemas.microsoft.com/office/word/2018/wordml" xmlns:w16du="http://schemas.microsoft.com/office/word/2023/wordml/word16du" xmlns:w16sdtdh="http://schemas.microsoft.com/office/word/2020/wordml/sdtdatahash" xmlns:w16sdtfl="http://schemas.microsoft.com/office/word/2024/wordml/sdtformatlock" xmlns:w16se="http://schemas.microsoft.com/office/word/2015/wordml/symex" xmlns:wpg="http://schemas.microsoft.com/office/word/2010/wordprocessingGroup" xmlns:wpi="http://schemas.microsoft.com/office/word/2010/wordprocessingInk" xmlns:wne="http://schemas.microsoft.com/office/word/2006/wordml" xmlns:wps="http://schemas.microsoft.com/office/word/2010/wordprocessingShape" mc:Ignorable="w14 w15 w16se w16cid w16 w16cex w16sdtdh w16sdtfl w16du wp14">
   <w:body>
     <w:p>
       <w:pPr>
@@ -18,39 +18,31 @@
           <w:sz w:val="28"/>
           <w:szCs w:val="28"/>
         </w:rPr>
-        <w:t>Practical 2: Linear and Binary Search: Iterative and Recursive</w:t>
-      </w:r>
-      <w:r>
+        <w:t>Practical 2: Linear and Binary Search: Iterative and Recursive Approaches</w:t>
+      </w:r>
+    </w:p>
+    <w:p>
+      <w:pPr>
         <w:rPr>
           <w:b/>
           <w:bCs/>
           <w:sz w:val="28"/>
           <w:szCs w:val="28"/>
         </w:rPr>
-        <w:t xml:space="preserve"> </w:t>
-      </w:r>
-      <w:r>
+      </w:pPr>
+    </w:p>
+    <w:p>
+      <w:pPr>
         <w:rPr>
           <w:b/>
           <w:bCs/>
-          <w:sz w:val="28"/>
-          <w:szCs w:val="28"/>
         </w:rPr>
-        <w:t>Approaches</w:t>
-      </w:r>
-    </w:p>
-    <w:p>
-      <w:pPr>
+      </w:pPr>
+      <w:r>
         <w:rPr>
           <w:b/>
           <w:bCs/>
-          <w:sz w:val="28"/>
-          <w:szCs w:val="28"/>
         </w:rPr>
-      </w:pPr>
-    </w:p>
-    <w:p>
-      <w:r>
         <w:t>Problem 1</w:t>
       </w:r>
     </w:p>
@@ -71,13 +63,8 @@
     </w:p>
     <w:p>
       <w:r>
-        <w:t xml:space="preserve">implement both approaches — one that checks plates one by one from the start, and one </w:t>
-      </w:r>
-      <w:proofErr w:type="gramStart"/>
-      <w:r>
-        <w:t>where</w:t>
-      </w:r>
-      <w:proofErr w:type="gramEnd"/>
+        <w:t>implement both approaches — one that checks plates one by one from the start, and one where</w:t>
+      </w:r>
     </w:p>
     <w:p>
       <w:r>
@@ -99,36 +86,137 @@
         <w:t>more than once in the list? Does it find the first occurrence, the last, or just any one?</w:t>
       </w:r>
     </w:p>
+    <w:p>
+      <w:pPr>
+        <w:rPr>
+          <w:b/>
+          <w:bCs/>
+        </w:rPr>
+      </w:pPr>
+    </w:p>
+    <w:p>
+      <w:pPr>
+        <w:rPr>
+          <w:b/>
+          <w:bCs/>
+        </w:rPr>
+      </w:pPr>
+      <w:r>
+        <w:rPr>
+          <w:b/>
+          <w:bCs/>
+        </w:rPr>
+        <w:t>Learning:</w:t>
+      </w:r>
+    </w:p>
+    <w:p>
+      <w:r>
+        <w:t>Here I show first how break when leave the middle of checking after helper arrive hoe fetch already continues loop that is biggest error I have occurred but it error I have been solved with using recusive function they return same function but next index value they will be taken.</w:t>
+      </w:r>
+    </w:p>
     <w:p/>
     <w:p>
-      <w:r>
-        <w:t xml:space="preserve">Here I show first how break when leave the middle of checking after helper arrive hoe fetch already continues loop that is biggest </w:t>
-      </w:r>
-      <w:proofErr w:type="gramStart"/>
-      <w:r>
-        <w:t>error</w:t>
-      </w:r>
-      <w:proofErr w:type="gramEnd"/>
-      <w:r>
-        <w:t xml:space="preserve"> I have occurred but it </w:t>
-      </w:r>
-      <w:proofErr w:type="gramStart"/>
-      <w:r>
-        <w:t>error</w:t>
-      </w:r>
-      <w:proofErr w:type="gramEnd"/>
-      <w:r>
-        <w:t xml:space="preserve"> I have been solved with using </w:t>
-      </w:r>
-      <w:proofErr w:type="spellStart"/>
-      <w:r>
-        <w:t>recusive</w:t>
-      </w:r>
-      <w:proofErr w:type="spellEnd"/>
-      <w:r>
-        <w:t xml:space="preserve"> function they return same function but next index value they will be taken.</w:t>
-      </w:r>
-    </w:p>
+      <w:pPr>
+        <w:rPr>
+          <w:b/>
+          <w:bCs/>
+        </w:rPr>
+      </w:pPr>
+      <w:r>
+        <w:rPr>
+          <w:b/>
+          <w:bCs/>
+        </w:rPr>
+        <w:t>Problem-2:</w:t>
+      </w:r>
+    </w:p>
+    <w:p>
+      <w:pPr>
+        <w:jc w:val="both"/>
+      </w:pPr>
+      <w:r>
+        <w:t>A librarian maintains a sorted catalog of book codes and needs to locate a specific code quickly.</w:t>
+      </w:r>
+    </w:p>
+    <w:p>
+      <w:pPr>
+        <w:jc w:val="both"/>
+      </w:pPr>
+      <w:r>
+        <w:t>Instead of going through every book, she opens the catalog to the middle, checks whether the</w:t>
+      </w:r>
+    </w:p>
+    <w:p>
+      <w:pPr>
+        <w:jc w:val="both"/>
+      </w:pPr>
+      <w:r>
+        <w:t>target is to the left or right, and repeats. Given a sorted list of book codes and a target code,</w:t>
+      </w:r>
+    </w:p>
+    <w:p>
+      <w:pPr>
+        <w:jc w:val="both"/>
+      </w:pPr>
+      <w:r>
+        <w:t>implement both approaches — one using a loop and one where the function calls itself — and</w:t>
+      </w:r>
+    </w:p>
+    <w:p>
+      <w:pPr>
+        <w:jc w:val="both"/>
+      </w:pPr>
+      <w:r>
+        <w:t>report the position of the target code.</w:t>
+      </w:r>
+      <w:r>
+        <w:t xml:space="preserve"> </w:t>
+      </w:r>
+      <w:r>
+        <w:t>Describe the approach you used. What is the one condition your input must satisfy for this</w:t>
+      </w:r>
+      <w:r>
+        <w:t xml:space="preserve"> </w:t>
+      </w:r>
+      <w:r>
+        <w:t>approach to work correctly? What would go wrong if that condition was not met?</w:t>
+      </w:r>
+    </w:p>
+    <w:p>
+      <w:pPr>
+        <w:jc w:val="both"/>
+      </w:pPr>
+    </w:p>
+    <w:p>
+      <w:pPr>
+        <w:jc w:val="both"/>
+      </w:pPr>
+    </w:p>
+    <w:p>
+      <w:pPr>
+        <w:jc w:val="both"/>
+        <w:rPr>
+          <w:b/>
+          <w:bCs/>
+        </w:rPr>
+      </w:pPr>
+      <w:r>
+        <w:rPr>
+          <w:b/>
+          <w:bCs/>
+        </w:rPr>
+        <w:t>Learning:</w:t>
+      </w:r>
+    </w:p>
+    <w:p>
+      <w:pPr>
+        <w:jc w:val="both"/>
+      </w:pPr>
+      <w:r>
+        <w:t>While implementing this problem, I faced challenges in correctly updating the left and right boundaries after comparing the middle element with the target. I also had to write the proper base case in the recursive approach to stop the search when the target was not found. This approach works correctly only if the list is sorted. If the list is not sorted, the search may discard the part containing the target and produce an incorrect result or fail to find the target even when it exists.</w:t>
+      </w:r>
+    </w:p>
+    <w:p/>
     <w:p/>
     <w:p/>
     <w:sectPr>

</xml_diff>